<commit_message>
docs(bd): BC Housing RFPQ verified from full document (1070-2526-229A)
Read the 41-page RFPQ + fillable forms. Confirmed: architects-only (AIBC
mandatory), structural NOT named/scored at prequal, play is downstream
Stage-Two teaming over the 3-yr roster led by DASH (CLT/seismic = KOR edge).
Added regions/caps, forecast volume, deadlines, BC Housing contacts.

Co-Authored-By: Claude Opus 4.8 (1M context) <noreply@anthropic.com>
</commit_message>
<xml_diff>
--- a/docs/KOR-BC-Housing-RFPQ-Teaming-Dossier-2026-06-25.docx
+++ b/docs/KOR-BC-Housing-RFPQ-Teaming-Dossier-2026-06-25.docx
@@ -797,7 +797,7 @@
               <w:rPr>
                 <w:sz w:val="19"/>
               </w:rPr>
-              <w:t xml:space="preserve"> (bcbid.gov.bc.ca)</w:t>
+              <w:t xml:space="preserve"> (RFPQ# 1070-2526-229A)</w:t>
             </w:r>
           </w:p>
         </w:tc>
@@ -838,30 +838,11 @@
             </w:pPr>
             <w:r>
               <w:rPr>
-                <w:sz w:val="19"/>
-              </w:rPr>
-              <w:t>Eligibility detail, regions, evaluation weightings, whether structural subs are named/scored</w:t>
-            </w:r>
-          </w:p>
-        </w:tc>
-        <w:tc>
-          <w:tcPr>
-            <w:tcW w:w="1667" w:type="pct"/>
-          </w:tcPr>
-          <w:p>
-            <w:pPr>
-              <w:pStyle w:val="Compact"/>
-              <w:rPr>
-                <w:sz w:val="19"/>
-              </w:rPr>
-            </w:pPr>
-            <w:r>
-              <w:rPr>
                 <w:b/>
                 <w:bCs/>
                 <w:sz w:val="19"/>
               </w:rPr>
-              <w:t>In the RFPQ document — behind BC Bid login</w:t>
+              <w:t>Eligibility</w:t>
             </w:r>
           </w:p>
         </w:tc>
@@ -882,7 +863,373 @@
                 <w:bCs/>
                 <w:sz w:val="19"/>
               </w:rPr>
-              <w:t>Needs the doc (§6)</w:t>
+              <w:t>AIBC membership + Certificate of Practice (architects only)</w:t>
+            </w:r>
+            <w:r>
+              <w:rPr>
+                <w:sz w:val="19"/>
+              </w:rPr>
+              <w:t>; 7 yrs architectural housing experience + 3 housing projects/10 yrs</w:t>
+            </w:r>
+          </w:p>
+        </w:tc>
+        <w:tc>
+          <w:tcPr>
+            <w:tcW w:w="1667" w:type="pct"/>
+          </w:tcPr>
+          <w:p>
+            <w:pPr>
+              <w:pStyle w:val="Compact"/>
+              <w:rPr>
+                <w:sz w:val="19"/>
+              </w:rPr>
+            </w:pPr>
+            <w:r>
+              <w:rPr>
+                <w:b/>
+                <w:bCs/>
+                <w:sz w:val="19"/>
+              </w:rPr>
+              <w:t>Confirmed — RFPQ §3.2</w:t>
+            </w:r>
+          </w:p>
+        </w:tc>
+      </w:tr>
+      <w:tr>
+        <w:trPr>
+          <w:cnfStyle w:val="000000100000" w:firstRow="0" w:lastRow="0" w:firstColumn="0" w:lastColumn="0" w:oddVBand="0" w:evenVBand="0" w:oddHBand="1" w:evenHBand="0" w:firstRowFirstColumn="0" w:firstRowLastColumn="0" w:lastRowFirstColumn="0" w:lastRowLastColumn="0"/>
+          <w:cantSplit/>
+        </w:trPr>
+        <w:tc>
+          <w:tcPr>
+            <w:tcW w:w="1667" w:type="pct"/>
+          </w:tcPr>
+          <w:p>
+            <w:pPr>
+              <w:pStyle w:val="Compact"/>
+              <w:rPr>
+                <w:sz w:val="19"/>
+              </w:rPr>
+            </w:pPr>
+            <w:r>
+              <w:rPr>
+                <w:b/>
+                <w:bCs/>
+                <w:sz w:val="19"/>
+              </w:rPr>
+              <w:t>Structural sub named/scored at prequal?</w:t>
+            </w:r>
+          </w:p>
+        </w:tc>
+        <w:tc>
+          <w:tcPr>
+            <w:tcW w:w="1667" w:type="pct"/>
+          </w:tcPr>
+          <w:p>
+            <w:pPr>
+              <w:pStyle w:val="Compact"/>
+              <w:rPr>
+                <w:sz w:val="19"/>
+              </w:rPr>
+            </w:pPr>
+            <w:r>
+              <w:rPr>
+                <w:b/>
+                <w:bCs/>
+                <w:sz w:val="19"/>
+              </w:rPr>
+              <w:t>NO</w:t>
+            </w:r>
+            <w:r>
+              <w:rPr>
+                <w:sz w:val="19"/>
+              </w:rPr>
+              <w:t xml:space="preserve"> </w:t>
+            </w:r>
+            <w:r>
+              <w:rPr>
+                <w:sz w:val="19"/>
+              </w:rPr>
+              <w:t>— rated criteria are Company Experience + Project Mgmt Plan only; no sub-consultant naming field anywhere</w:t>
+            </w:r>
+          </w:p>
+        </w:tc>
+        <w:tc>
+          <w:tcPr>
+            <w:tcW w:w="1667" w:type="pct"/>
+          </w:tcPr>
+          <w:p>
+            <w:pPr>
+              <w:pStyle w:val="Compact"/>
+              <w:rPr>
+                <w:sz w:val="19"/>
+              </w:rPr>
+            </w:pPr>
+            <w:r>
+              <w:rPr>
+                <w:b/>
+                <w:bCs/>
+                <w:sz w:val="19"/>
+              </w:rPr>
+              <w:t>Confirmed — RFPQ Part 2, §3.3, App. D</w:t>
+            </w:r>
+          </w:p>
+        </w:tc>
+      </w:tr>
+      <w:tr>
+        <w:trPr>
+          <w:cantSplit/>
+        </w:trPr>
+        <w:tc>
+          <w:tcPr>
+            <w:tcW w:w="1667" w:type="pct"/>
+          </w:tcPr>
+          <w:p>
+            <w:pPr>
+              <w:pStyle w:val="Compact"/>
+              <w:rPr>
+                <w:sz w:val="19"/>
+              </w:rPr>
+            </w:pPr>
+            <w:r>
+              <w:rPr>
+                <w:sz w:val="19"/>
+              </w:rPr>
+              <w:t>Regions + roster caps</w:t>
+            </w:r>
+          </w:p>
+        </w:tc>
+        <w:tc>
+          <w:tcPr>
+            <w:tcW w:w="1667" w:type="pct"/>
+          </w:tcPr>
+          <w:p>
+            <w:pPr>
+              <w:pStyle w:val="Compact"/>
+              <w:rPr>
+                <w:sz w:val="19"/>
+              </w:rPr>
+            </w:pPr>
+            <w:r>
+              <w:rPr>
+                <w:sz w:val="19"/>
+              </w:rPr>
+              <w:t>Lower Mainland 12 · Vancouver Island 8 · Interior 8 · Northern 6 (same for DASH)</w:t>
+            </w:r>
+          </w:p>
+        </w:tc>
+        <w:tc>
+          <w:tcPr>
+            <w:tcW w:w="1667" w:type="pct"/>
+          </w:tcPr>
+          <w:p>
+            <w:pPr>
+              <w:pStyle w:val="Compact"/>
+              <w:rPr>
+                <w:sz w:val="19"/>
+              </w:rPr>
+            </w:pPr>
+            <w:r>
+              <w:rPr>
+                <w:sz w:val="19"/>
+              </w:rPr>
+              <w:t>Confirmed §3.5</w:t>
+            </w:r>
+          </w:p>
+        </w:tc>
+      </w:tr>
+      <w:tr>
+        <w:trPr>
+          <w:cnfStyle w:val="000000100000" w:firstRow="0" w:lastRow="0" w:firstColumn="0" w:lastColumn="0" w:oddVBand="0" w:evenVBand="0" w:oddHBand="1" w:evenHBand="0" w:firstRowFirstColumn="0" w:firstRowLastColumn="0" w:lastRowFirstColumn="0" w:lastRowLastColumn="0"/>
+          <w:cantSplit/>
+        </w:trPr>
+        <w:tc>
+          <w:tcPr>
+            <w:tcW w:w="1667" w:type="pct"/>
+          </w:tcPr>
+          <w:p>
+            <w:pPr>
+              <w:pStyle w:val="Compact"/>
+              <w:rPr>
+                <w:sz w:val="19"/>
+              </w:rPr>
+            </w:pPr>
+            <w:r>
+              <w:rPr>
+                <w:sz w:val="19"/>
+              </w:rPr>
+              <w:t>Forecast volume (3 yrs)</w:t>
+            </w:r>
+          </w:p>
+        </w:tc>
+        <w:tc>
+          <w:tcPr>
+            <w:tcW w:w="1667" w:type="pct"/>
+          </w:tcPr>
+          <w:p>
+            <w:pPr>
+              <w:pStyle w:val="Compact"/>
+              <w:rPr>
+                <w:sz w:val="19"/>
+              </w:rPr>
+            </w:pPr>
+            <w:r>
+              <w:rPr>
+                <w:sz w:val="19"/>
+              </w:rPr>
+              <w:t>~10–15 multi-unit (primarily DASH) + ~15–20 group home Stage Two solicitations</w:t>
+            </w:r>
+          </w:p>
+        </w:tc>
+        <w:tc>
+          <w:tcPr>
+            <w:tcW w:w="1667" w:type="pct"/>
+          </w:tcPr>
+          <w:p>
+            <w:pPr>
+              <w:pStyle w:val="Compact"/>
+              <w:rPr>
+                <w:sz w:val="19"/>
+              </w:rPr>
+            </w:pPr>
+            <w:r>
+              <w:rPr>
+                <w:sz w:val="19"/>
+              </w:rPr>
+              <w:t>Confirmed §1.11.1</w:t>
+            </w:r>
+          </w:p>
+        </w:tc>
+      </w:tr>
+      <w:tr>
+        <w:trPr>
+          <w:cantSplit/>
+        </w:trPr>
+        <w:tc>
+          <w:tcPr>
+            <w:tcW w:w="1667" w:type="pct"/>
+          </w:tcPr>
+          <w:p>
+            <w:pPr>
+              <w:pStyle w:val="Compact"/>
+              <w:rPr>
+                <w:sz w:val="19"/>
+              </w:rPr>
+            </w:pPr>
+            <w:r>
+              <w:rPr>
+                <w:sz w:val="19"/>
+              </w:rPr>
+              <w:t>Deadlines</w:t>
+            </w:r>
+          </w:p>
+        </w:tc>
+        <w:tc>
+          <w:tcPr>
+            <w:tcW w:w="1667" w:type="pct"/>
+          </w:tcPr>
+          <w:p>
+            <w:pPr>
+              <w:pStyle w:val="Compact"/>
+              <w:rPr>
+                <w:sz w:val="19"/>
+              </w:rPr>
+            </w:pPr>
+            <w:r>
+              <w:rPr>
+                <w:sz w:val="19"/>
+              </w:rPr>
+              <w:t xml:space="preserve">Questions 29 Jun · Addenda 7 Jul · </w:t>
+            </w:r>
+            <w:r>
+              <w:rPr>
+                <w:b/>
+                <w:bCs/>
+                <w:sz w:val="19"/>
+              </w:rPr>
+              <w:t>Submission 22 Jul 2026 @ 2 PM PST</w:t>
+            </w:r>
+          </w:p>
+        </w:tc>
+        <w:tc>
+          <w:tcPr>
+            <w:tcW w:w="1667" w:type="pct"/>
+          </w:tcPr>
+          <w:p>
+            <w:pPr>
+              <w:pStyle w:val="Compact"/>
+              <w:rPr>
+                <w:sz w:val="19"/>
+              </w:rPr>
+            </w:pPr>
+            <w:r>
+              <w:rPr>
+                <w:sz w:val="19"/>
+              </w:rPr>
+              <w:t>Confirmed §1.8</w:t>
+            </w:r>
+          </w:p>
+        </w:tc>
+      </w:tr>
+      <w:tr>
+        <w:trPr>
+          <w:cnfStyle w:val="000000100000" w:firstRow="0" w:lastRow="0" w:firstColumn="0" w:lastColumn="0" w:oddVBand="0" w:evenVBand="0" w:oddHBand="1" w:evenHBand="0" w:firstRowFirstColumn="0" w:firstRowLastColumn="0" w:lastRowFirstColumn="0" w:lastRowLastColumn="0"/>
+          <w:cantSplit/>
+        </w:trPr>
+        <w:tc>
+          <w:tcPr>
+            <w:tcW w:w="1667" w:type="pct"/>
+          </w:tcPr>
+          <w:p>
+            <w:pPr>
+              <w:pStyle w:val="Compact"/>
+              <w:rPr>
+                <w:sz w:val="19"/>
+              </w:rPr>
+            </w:pPr>
+            <w:r>
+              <w:rPr>
+                <w:sz w:val="19"/>
+              </w:rPr>
+              <w:t>BC Housing contacts</w:t>
+            </w:r>
+          </w:p>
+        </w:tc>
+        <w:tc>
+          <w:tcPr>
+            <w:tcW w:w="1667" w:type="pct"/>
+          </w:tcPr>
+          <w:p>
+            <w:pPr>
+              <w:pStyle w:val="Compact"/>
+              <w:rPr>
+                <w:sz w:val="19"/>
+              </w:rPr>
+            </w:pPr>
+            <w:r>
+              <w:rPr>
+                <w:sz w:val="19"/>
+              </w:rPr>
+              <w:t>Sherry Azimi sazimi@bchousing.org · Lucia Campos Pacheco lpacheco@bchousing.org</w:t>
+            </w:r>
+          </w:p>
+        </w:tc>
+        <w:tc>
+          <w:tcPr>
+            <w:tcW w:w="1667" w:type="pct"/>
+          </w:tcPr>
+          <w:p>
+            <w:pPr>
+              <w:pStyle w:val="Compact"/>
+              <w:rPr>
+                <w:sz w:val="19"/>
+              </w:rPr>
+            </w:pPr>
+            <w:r>
+              <w:rPr>
+                <w:sz w:val="19"/>
+              </w:rPr>
+              <w:t>Confirmed §1.9</w:t>
             </w:r>
           </w:p>
         </w:tc>
@@ -893,10 +1240,10 @@
         <w:pStyle w:val="Heading2"/>
         <w:pageBreakBefore/>
       </w:pPr>
-      <w:bookmarkStart w:id="3" w:name="how-kor-participates-teaming-mechanics"/>
+      <w:bookmarkStart w:id="3" w:name="Xbe005b8a5990633b0daaa3cb1c1ea45214779f2"/>
       <w:bookmarkEnd w:id="2"/>
       <w:r>
-        <w:t>3. How KOR participates (teaming mechanics)</w:t>
+        <w:t>3. How KOR participates (teaming mechanics) — now CONFIRMED from the RFPQ</w:t>
       </w:r>
     </w:p>
     <w:p>
@@ -904,27 +1251,7 @@
         <w:pStyle w:val="FirstParagraph"/>
       </w:pPr>
       <w:r>
-        <w:t xml:space="preserve">On BC Housing buildings the </w:t>
-      </w:r>
-      <w:r>
-        <w:rPr>
-          <w:b/>
-          <w:bCs/>
-        </w:rPr>
-        <w:t>architect is the prime consultant</w:t>
-      </w:r>
-      <w:r>
-        <w:t xml:space="preserve">: they assemble the full team — structural included — and submit one application, scored on the team’s P.Eng depth and similar-project experience. </w:t>
-      </w:r>
-      <w:r>
-        <w:rPr>
-          <w:b/>
-          <w:bCs/>
-        </w:rPr>
-        <w:t>KOR wins the structural seat by being on the architect’s team before they submit.</w:t>
-      </w:r>
-      <w:r>
-        <w:t xml:space="preserve"> So:</w:t>
+        <w:t>The RFPQ documents resolve the open question cold:</w:t>
       </w:r>
     </w:p>
     <w:p>
@@ -936,14 +1263,14 @@
         </w:numPr>
       </w:pPr>
       <w:r>
-        <w:t xml:space="preserve">KOR cannot apply as an “architectural firm,” and a structural firm acting as solo “prime consultant” for housing design is atypical → </w:t>
-      </w:r>
-      <w:r>
         <w:rPr>
           <w:b/>
           <w:bCs/>
         </w:rPr>
-        <w:t>no direct KOR application.</w:t>
+        <w:t>KOR cannot be on this roster — it is architects-only.</w:t>
+      </w:r>
+      <w:r>
+        <w:t xml:space="preserve"> Mandatory Requirement (§3.2, pass/fail) requires AIBC membership + Certificate of Practice; the experience gate is architectural (Principal-in-Charge / Project Architect). A structural firm fails Phase 1. There was never a KOR application to make.</w:t>
       </w:r>
     </w:p>
     <w:p>
@@ -955,27 +1282,55 @@
         </w:numPr>
       </w:pPr>
       <w:r>
-        <w:t xml:space="preserve">The </w:t>
-      </w:r>
-      <w:r>
         <w:rPr>
           <w:b/>
           <w:bCs/>
         </w:rPr>
-        <w:t>DASH / prefab + BIM stream</w:t>
-      </w:r>
-      <w:r>
-        <w:t xml:space="preserve"> is KOR’s strongest technical angle — KOR’s </w:t>
+        <w:lastRenderedPageBreak/>
+        <w:t>The structural engineer is NOT named or scored at the prequal stage.</w:t>
+      </w:r>
+      <w:r>
+        <w:t xml:space="preserve"> Rated criteria (§3.3) are only </w:t>
+      </w:r>
+      <w:r>
+        <w:rPr>
+          <w:i/>
+          <w:iCs/>
+        </w:rPr>
+        <w:t>Company Information &amp; Experience</w:t>
+      </w:r>
+      <w:r>
+        <w:t xml:space="preserve"> and </w:t>
+      </w:r>
+      <w:r>
+        <w:rPr>
+          <w:i/>
+          <w:iCs/>
+        </w:rPr>
+        <w:t>Project Management Plan</w:t>
+      </w:r>
+      <w:r>
+        <w:t xml:space="preserve"> (60% threshold). The Experience Form (Appendix D) has </w:t>
       </w:r>
       <w:r>
         <w:rPr>
           <w:b/>
           <w:bCs/>
         </w:rPr>
-        <w:t>mass-timber + concrete hybrid</w:t>
-      </w:r>
-      <w:r>
-        <w:t xml:space="preserve"> and modular positioning is exactly what that stream rewards. Lead the pitch there.</w:t>
+        <w:t>no field to name a structural engineer or any sub-consultant.</w:t>
+      </w:r>
+      <w:r>
+        <w:t xml:space="preserve"> So being on an architect’s team buys KOR nothing </w:t>
+      </w:r>
+      <w:r>
+        <w:rPr>
+          <w:i/>
+          <w:iCs/>
+        </w:rPr>
+        <w:t>in this RFPQ’s scoring</w:t>
+      </w:r>
+      <w:r>
+        <w:t>.</w:t>
       </w:r>
     </w:p>
     <w:p>
@@ -987,27 +1342,92 @@
         </w:numPr>
       </w:pPr>
       <w:r>
-        <w:t xml:space="preserve">The </w:t>
-      </w:r>
-      <w:r>
         <w:rPr>
           <w:b/>
           <w:bCs/>
         </w:rPr>
-        <w:t>29 Jun inquiry window</w:t>
-      </w:r>
-      <w:r>
-        <w:t xml:space="preserve"> is for formal RFPQ-clarification questions answered publicly via addendum — </w:t>
+        <w:t>The play is purely downstream and relationship-based, over a 3-year runway.</w:t>
+      </w:r>
+      <w:r>
+        <w:t xml:space="preserve"> </w:t>
+      </w:r>
+      <w:r>
+        <w:t xml:space="preserve">The contract is RAIC Doc 6 (BC Housing ↔ architect). Rostered architects get invited to </w:t>
       </w:r>
       <w:r>
         <w:rPr>
           <w:b/>
           <w:bCs/>
         </w:rPr>
-        <w:t>not</w:t>
-      </w:r>
-      <w:r>
-        <w:t xml:space="preserve"> competitor intel. Use it only if there’s a genuine eligibility question (e.g., “Are named structural sub-consultants and their experience evaluated in the team submission?”).</w:t>
+        <w:t>Stage Two project solicitations</w:t>
+      </w:r>
+      <w:r>
+        <w:t xml:space="preserve"> across the 3-year term; when they win a project they assemble the consultant team and bring their structural engineer. KOR’s goal: </w:t>
+      </w:r>
+      <w:r>
+        <w:rPr>
+          <w:b/>
+          <w:bCs/>
+        </w:rPr>
+        <w:t>be the structural partner rostered architects pull onto their BC Housing projects, project by project.</w:t>
+      </w:r>
+    </w:p>
+    <w:p>
+      <w:pPr>
+        <w:pStyle w:val="Compact"/>
+        <w:numPr>
+          <w:ilvl w:val="0"/>
+          <w:numId w:val="3"/>
+        </w:numPr>
+      </w:pPr>
+      <w:r>
+        <w:rPr>
+          <w:b/>
+          <w:bCs/>
+        </w:rPr>
+        <w:t>DASH is built for KOR’s edge — lead with it.</w:t>
+      </w:r>
+      <w:r>
+        <w:t xml:space="preserve"> DASH is mid-rise wood-frame up to 6 storeys with </w:t>
+      </w:r>
+      <w:r>
+        <w:rPr>
+          <w:b/>
+          <w:bCs/>
+        </w:rPr>
+        <w:t>optional CLT shear walls/floors, configurable for seismic zones</w:t>
+      </w:r>
+      <w:r>
+        <w:t xml:space="preserve"> (§1.7) — KOR’s mass-timber + seismic wheelhouse. It’s also where the volume is (~10–15 multi-unit solicitations vs ~15–20 small group homes). Pitch KOR as the CLT/panelized + seismic structural partner for architects’ DASH work.</w:t>
+      </w:r>
+    </w:p>
+    <w:p>
+      <w:pPr>
+        <w:pStyle w:val="Compact"/>
+        <w:numPr>
+          <w:ilvl w:val="0"/>
+          <w:numId w:val="3"/>
+        </w:numPr>
+      </w:pPr>
+      <w:r>
+        <w:rPr>
+          <w:b/>
+          <w:bCs/>
+        </w:rPr>
+        <w:t>No value in the 29 Jun inquiry window for KOR</w:t>
+      </w:r>
+      <w:r>
+        <w:t xml:space="preserve"> — it’s public RFPQ clarification for </w:t>
+      </w:r>
+      <w:r>
+        <w:rPr>
+          <w:i/>
+          <w:iCs/>
+        </w:rPr>
+        <w:t>proponents</w:t>
+      </w:r>
+      <w:r>
+        <w:t xml:space="preserve"> (architects), not a channel for KOR. Skip it.</w:t>
       </w:r>
     </w:p>
     <w:p>
@@ -1256,14 +1676,7 @@
               <w:rPr>
                 <w:sz w:val="19"/>
               </w:rPr>
-              <w:t xml:space="preserve"> — repeat affordable-housing architect (BC Housing New </w:t>
-            </w:r>
-            <w:r>
-              <w:rPr>
-                <w:sz w:val="19"/>
-              </w:rPr>
-              <w:lastRenderedPageBreak/>
-              <w:t>West 1923 Marine Way)</w:t>
+              <w:t xml:space="preserve"> — repeat affordable-housing architect (BC Housing New West 1923 Marine Way)</w:t>
             </w:r>
           </w:p>
         </w:tc>
@@ -1284,7 +1697,6 @@
                 <w:bCs/>
                 <w:sz w:val="19"/>
               </w:rPr>
-              <w:lastRenderedPageBreak/>
               <w:t>Stu Lyon</w:t>
             </w:r>
             <w:r>
@@ -1330,14 +1742,7 @@
               <w:rPr>
                 <w:sz w:val="19"/>
               </w:rPr>
-              <w:t xml:space="preserve"> abrudar@gblarc</w:t>
-            </w:r>
-            <w:r>
-              <w:rPr>
-                <w:sz w:val="19"/>
-              </w:rPr>
-              <w:lastRenderedPageBreak/>
-              <w:t xml:space="preserve">hitects.com </w:t>
+              <w:t xml:space="preserve"> abrudar@gblarchitects.com </w:t>
             </w:r>
             <w:r>
               <w:rPr>
@@ -1365,21 +1770,19 @@
                 <w:bCs/>
                 <w:sz w:val="19"/>
               </w:rPr>
-              <w:lastRenderedPageBreak/>
               <w:t>#1 call.</w:t>
             </w:r>
             <w:r>
               <w:rPr>
                 <w:sz w:val="19"/>
               </w:rPr>
-              <w:t xml:space="preserve"> Warm + proven BC Housing. Ask to be their named SE on the BC Housing roster </w:t>
-            </w:r>
-            <w:r>
-              <w:rPr>
-                <w:sz w:val="19"/>
-              </w:rPr>
-              <w:lastRenderedPageBreak/>
-              <w:t>submission (both streams).</w:t>
+              <w:t xml:space="preserve"> </w:t>
+            </w:r>
+            <w:r>
+              <w:rPr>
+                <w:sz w:val="19"/>
+              </w:rPr>
+              <w:t>Warm + proven BC Housing. Ask to be their named SE on the BC Housing roster submission (both streams).</w:t>
             </w:r>
           </w:p>
         </w:tc>
@@ -1405,7 +1808,6 @@
                 <w:bCs/>
                 <w:sz w:val="19"/>
               </w:rPr>
-              <w:lastRenderedPageBreak/>
               <w:t>NSDA Architects</w:t>
             </w:r>
           </w:p>
@@ -1568,6 +1970,7 @@
                 <w:bCs/>
                 <w:sz w:val="19"/>
               </w:rPr>
+              <w:lastRenderedPageBreak/>
               <w:t>Studio One Architecture</w:t>
             </w:r>
           </w:p>
@@ -2172,20 +2575,7 @@
               <w:rPr>
                 <w:sz w:val="19"/>
               </w:rPr>
-              <w:t xml:space="preserve"> </w:t>
-            </w:r>
-            <w:r>
-              <w:rPr>
-                <w:sz w:val="19"/>
-              </w:rPr>
-              <w:t xml:space="preserve">(Brock Commons precedent) — strong </w:t>
-            </w:r>
-            <w:r>
-              <w:rPr>
-                <w:sz w:val="19"/>
-              </w:rPr>
-              <w:lastRenderedPageBreak/>
-              <w:t>DASH-stream fit</w:t>
+              <w:t xml:space="preserve"> (Brock Commons precedent) — strong DASH-stream fit</w:t>
             </w:r>
           </w:p>
         </w:tc>
@@ -2206,7 +2596,6 @@
                 <w:bCs/>
                 <w:sz w:val="19"/>
               </w:rPr>
-              <w:lastRenderedPageBreak/>
               <w:t>Russell Acton</w:t>
             </w:r>
             <w:r>
@@ -2252,14 +2641,7 @@
               <w:rPr>
                 <w:sz w:val="19"/>
               </w:rPr>
-              <w:t xml:space="preserve"> mostry@actonostry.</w:t>
-            </w:r>
-            <w:r>
-              <w:rPr>
-                <w:sz w:val="19"/>
-              </w:rPr>
-              <w:lastRenderedPageBreak/>
-              <w:t xml:space="preserve">ca </w:t>
+              <w:t xml:space="preserve"> mostry@actonostry.ca </w:t>
             </w:r>
             <w:r>
               <w:rPr>
@@ -2292,7 +2674,6 @@
                 <w:bCs/>
                 <w:sz w:val="19"/>
               </w:rPr>
-              <w:lastRenderedPageBreak/>
               <w:t>Ryder Architecture</w:t>
             </w:r>
           </w:p>
@@ -2401,7 +2782,11 @@
         <w:t>Ryan Bragg</w:t>
       </w:r>
       <w:r>
-        <w:t xml:space="preserve"> ryan.bragg@perkinswill.com ✓ · Revery — </w:t>
+        <w:t xml:space="preserve"> </w:t>
+      </w:r>
+      <w:r>
+        <w:lastRenderedPageBreak/>
+        <w:t xml:space="preserve">ryan.bragg@perkinswill.com ✓ · Revery — </w:t>
       </w:r>
       <w:r>
         <w:rPr>
@@ -2492,7 +2877,10 @@
         <w:t>Call GBL (Stu Lyon / Amela Brudar) first</w:t>
       </w:r>
       <w:r>
-        <w:t xml:space="preserve"> — warm + proven BC Housing. Ask to be the named SE on their roster submission, both streams.</w:t>
+        <w:t xml:space="preserve"> </w:t>
+      </w:r>
+      <w:r>
+        <w:t>— warm + proven BC Housing. Ask to be the named SE on their roster submission, both streams.</w:t>
       </w:r>
     </w:p>
     <w:p>
@@ -2576,11 +2964,39 @@
         <w:pStyle w:val="Heading2"/>
         <w:pageBreakBefore/>
       </w:pPr>
-      <w:bookmarkStart w:id="11" w:name="Xa75f676b611de72f35559a9d855d1668c93859d"/>
+      <w:bookmarkStart w:id="11" w:name="X71d06325813b0bc467143adf93a7c146a270538"/>
       <w:bookmarkEnd w:id="10"/>
       <w:r>
-        <w:lastRenderedPageBreak/>
-        <w:t>6. What to pull from BC Bid (you offered — this upgrades the dossier from inference to fact)</w:t>
+        <w:t>6. Document review — COMPLETE (RFPQ 1070-2526-229A, read 25 Jun 2026)</w:t>
+      </w:r>
+    </w:p>
+    <w:p>
+      <w:pPr>
+        <w:pStyle w:val="FirstParagraph"/>
+      </w:pPr>
+      <w:r>
+        <w:t xml:space="preserve">Both priority documents (main RFPQ PDF + Fillable Forms DOCX) were pulled and read. Confirmed findings are folded into §2 and §3 above. Net: </w:t>
+      </w:r>
+      <w:r>
+        <w:rPr>
+          <w:b/>
+          <w:bCs/>
+        </w:rPr>
+        <w:t>KOR cannot apply (AIBC-only); structural is not scored at prequal; the play is downstream Stage-Two teaming with rostered architects over the 3-year term, led by DASH.</w:t>
+      </w:r>
+      <w:r>
+        <w:t xml:space="preserve"> No plan-takers/interested-supplier list is published for this opportunity, so applicant identification falls back to KOR’s relationship graph (§4) — GBL and NSDA first.</w:t>
+      </w:r>
+    </w:p>
+    <w:p>
+      <w:pPr>
+        <w:pStyle w:val="Heading2"/>
+        <w:pageBreakBefore/>
+      </w:pPr>
+      <w:bookmarkStart w:id="12" w:name="backing-data-sources"/>
+      <w:bookmarkEnd w:id="11"/>
+      <w:r>
+        <w:t>7. Backing data + sources</w:t>
       </w:r>
     </w:p>
     <w:p>
@@ -2596,50 +3012,10 @@
           <w:b/>
           <w:bCs/>
         </w:rPr>
-        <w:t>RFPQ 230763 documents</w:t>
-      </w:r>
-      <w:r>
-        <w:t xml:space="preserve"> (log into BC Bid → opportunity 230763 → download): confirms </w:t>
-      </w:r>
-      <w:r>
-        <w:rPr>
-          <w:b/>
-          <w:bCs/>
-        </w:rPr>
-        <w:t>eligibility</w:t>
-      </w:r>
-      <w:r>
-        <w:t xml:space="preserve"> (can structural subs be named/scored?), </w:t>
-      </w:r>
-      <w:r>
-        <w:rPr>
-          <w:b/>
-          <w:bCs/>
-        </w:rPr>
-        <w:t>regions</w:t>
-      </w:r>
-      <w:r>
-        <w:t xml:space="preserve">, </w:t>
-      </w:r>
-      <w:r>
-        <w:rPr>
-          <w:b/>
-          <w:bCs/>
-        </w:rPr>
-        <w:t>3-year term details</w:t>
-      </w:r>
-      <w:r>
-        <w:t xml:space="preserve">, and </w:t>
-      </w:r>
-      <w:r>
-        <w:rPr>
-          <w:b/>
-          <w:bCs/>
-        </w:rPr>
-        <w:t>evaluation criteria/weightings</w:t>
-      </w:r>
-      <w:r>
-        <w:t>. Paste these and I’ll fold them in + tailor the architect pitch to what’s actually scored.</w:t>
+        <w:t>KOR Lower Mainland BD Field Guide (2026-06-17)</w:t>
+      </w:r>
+      <w:r>
+        <w:t xml:space="preserve"> — Deltek-verified architect teaming table (depth + verified contacts); the prime-consultant teaming model.</w:t>
       </w:r>
     </w:p>
     <w:p>
@@ -2655,41 +3031,11 @@
           <w:b/>
           <w:bCs/>
         </w:rPr>
-        <w:t>Plan-takers / plan-holders list for 230763</w:t>
-      </w:r>
-      <w:r>
-        <w:t xml:space="preserve"> (visible on many BC Bid opportunity pages): the firms that have downloaded the docs = the realistic </w:t>
-      </w:r>
-      <w:r>
-        <w:rPr>
-          <w:b/>
-          <w:bCs/>
-        </w:rPr>
-        <w:t>who’s-applying</w:t>
-      </w:r>
-      <w:r>
-        <w:t xml:space="preserve"> signal. KOR’s platform has a </w:t>
-      </w:r>
-      <w:r>
-        <w:rPr>
-          <w:b/>
-          <w:bCs/>
-        </w:rPr>
-        <w:t>BC Bid plan-taker extractor</w:t>
-      </w:r>
-      <w:r>
-        <w:t xml:space="preserve"> that can scrape this with KOR’s BCeID login; or you can read it off the page. Cross-referenced against §4, that tells us exactly which warm architects to lock down.</w:t>
-      </w:r>
-    </w:p>
-    <w:p>
-      <w:pPr>
-        <w:pStyle w:val="Heading2"/>
-        <w:pageBreakBefore/>
-      </w:pPr>
-      <w:bookmarkStart w:id="12" w:name="backing-data-sources"/>
-      <w:bookmarkEnd w:id="11"/>
-      <w:r>
-        <w:t>7. Backing data + sources</w:t>
+        <w:lastRenderedPageBreak/>
+        <w:t>BC Housing SE Seat Pursuit Report (2026-06-20)</w:t>
+      </w:r>
+      <w:r>
+        <w:t xml:space="preserve"> — confirms GBL as a repeat BC-Housing affordable-housing architect (New West 1923 Marine Way) + Zeidler/Hunter/Formline on active BC Housing projects.</w:t>
       </w:r>
     </w:p>
     <w:p>
@@ -2697,45 +3043,7 @@
         <w:pStyle w:val="Compact"/>
         <w:numPr>
           <w:ilvl w:val="0"/>
-          <w:numId w:val="6"/>
-        </w:numPr>
-      </w:pPr>
-      <w:r>
-        <w:rPr>
-          <w:b/>
-          <w:bCs/>
-        </w:rPr>
-        <w:t>KOR Lower Mainland BD Field Guide (2026-06-17)</w:t>
-      </w:r>
-      <w:r>
-        <w:t xml:space="preserve"> — Deltek-verified architect teaming table (depth + verified contacts); the prime-consultant teaming model.</w:t>
-      </w:r>
-    </w:p>
-    <w:p>
-      <w:pPr>
-        <w:pStyle w:val="Compact"/>
-        <w:numPr>
-          <w:ilvl w:val="0"/>
-          <w:numId w:val="6"/>
-        </w:numPr>
-      </w:pPr>
-      <w:r>
-        <w:rPr>
-          <w:b/>
-          <w:bCs/>
-        </w:rPr>
-        <w:t>BC Housing SE Seat Pursuit Report (2026-06-20)</w:t>
-      </w:r>
-      <w:r>
-        <w:t xml:space="preserve"> — confirms GBL as a repeat BC-Housing affordable-housing architect (New West 1923 Marine Way) + Zeidler/Hunter/Formline on active BC Housing projects.</w:t>
-      </w:r>
-    </w:p>
-    <w:p>
-      <w:pPr>
-        <w:pStyle w:val="Compact"/>
-        <w:numPr>
-          <w:ilvl w:val="0"/>
-          <w:numId w:val="6"/>
+          <w:numId w:val="5"/>
         </w:numPr>
       </w:pPr>
       <w:r>
@@ -2754,7 +3062,7 @@
         <w:pStyle w:val="Compact"/>
         <w:numPr>
           <w:ilvl w:val="0"/>
-          <w:numId w:val="6"/>
+          <w:numId w:val="5"/>
         </w:numPr>
       </w:pPr>
       <w:r>
@@ -2836,7 +3144,7 @@
   <w:abstractNum w:abstractNumId="0" w15:restartNumberingAfterBreak="0">
     <w:nsid w:val="0000A990"/>
     <w:multiLevelType w:val="multilevel"/>
-    <w:tmpl w:val="1E589EB2"/>
+    <w:tmpl w:val="CF50B700"/>
     <w:lvl w:ilvl="0">
       <w:numFmt w:val="bullet"/>
       <w:lvlText w:val=" "/>
@@ -2913,7 +3221,7 @@
   <w:abstractNum w:abstractNumId="1" w15:restartNumberingAfterBreak="0">
     <w:nsid w:val="0000A991"/>
     <w:multiLevelType w:val="multilevel"/>
-    <w:tmpl w:val="1D8E560A"/>
+    <w:tmpl w:val="2666A39E"/>
     <w:lvl w:ilvl="0">
       <w:numFmt w:val="bullet"/>
       <w:lvlText w:val=""/>
@@ -3017,7 +3325,7 @@
   <w:abstractNum w:abstractNumId="2" w15:restartNumberingAfterBreak="0">
     <w:nsid w:val="00A99411"/>
     <w:multiLevelType w:val="multilevel"/>
-    <w:tmpl w:val="1A0EF970"/>
+    <w:tmpl w:val="CB8C5CAC"/>
     <w:lvl w:ilvl="0">
       <w:start w:val="1"/>
       <w:numFmt w:val="decimal"/>
@@ -3100,16 +3408,16 @@
       </w:pPr>
     </w:lvl>
   </w:abstractNum>
-  <w:num w:numId="1" w16cid:durableId="59719601">
+  <w:num w:numId="1" w16cid:durableId="385449183">
     <w:abstractNumId w:val="0"/>
   </w:num>
-  <w:num w:numId="2" w16cid:durableId="486627063">
+  <w:num w:numId="2" w16cid:durableId="1647736016">
     <w:abstractNumId w:val="1"/>
   </w:num>
-  <w:num w:numId="3" w16cid:durableId="1428309105">
+  <w:num w:numId="3" w16cid:durableId="385569690">
     <w:abstractNumId w:val="1"/>
   </w:num>
-  <w:num w:numId="4" w16cid:durableId="452552680">
+  <w:num w:numId="4" w16cid:durableId="1887184356">
     <w:abstractNumId w:val="2"/>
     <w:lvlOverride w:ilvl="0">
       <w:startOverride w:val="1"/>
@@ -3139,37 +3447,7 @@
       <w:startOverride w:val="1"/>
     </w:lvlOverride>
   </w:num>
-  <w:num w:numId="5" w16cid:durableId="59866892">
-    <w:abstractNumId w:val="2"/>
-    <w:lvlOverride w:ilvl="0">
-      <w:startOverride w:val="1"/>
-    </w:lvlOverride>
-    <w:lvlOverride w:ilvl="1">
-      <w:startOverride w:val="1"/>
-    </w:lvlOverride>
-    <w:lvlOverride w:ilvl="2">
-      <w:startOverride w:val="1"/>
-    </w:lvlOverride>
-    <w:lvlOverride w:ilvl="3">
-      <w:startOverride w:val="1"/>
-    </w:lvlOverride>
-    <w:lvlOverride w:ilvl="4">
-      <w:startOverride w:val="1"/>
-    </w:lvlOverride>
-    <w:lvlOverride w:ilvl="5">
-      <w:startOverride w:val="1"/>
-    </w:lvlOverride>
-    <w:lvlOverride w:ilvl="6">
-      <w:startOverride w:val="1"/>
-    </w:lvlOverride>
-    <w:lvlOverride w:ilvl="7">
-      <w:startOverride w:val="1"/>
-    </w:lvlOverride>
-    <w:lvlOverride w:ilvl="8">
-      <w:startOverride w:val="1"/>
-    </w:lvlOverride>
-  </w:num>
-  <w:num w:numId="6" w16cid:durableId="95105641">
+  <w:num w:numId="5" w16cid:durableId="1937706228">
     <w:abstractNumId w:val="1"/>
   </w:num>
 </w:numbering>
@@ -4404,7 +4682,7 @@
     <w:name w:val="Grid Table 4"/>
     <w:basedOn w:val="TableNormal"/>
     <w:uiPriority w:val="49"/>
-    <w:rsid w:val="009A0C24"/>
+    <w:rsid w:val="00207110"/>
     <w:pPr>
       <w:spacing w:after="0"/>
     </w:pPr>

</xml_diff>

<commit_message>
docs(bd): BC Housing dossier - no page breaks, compact flow (-NoPageBreaks)
Co-Authored-By: Claude Opus 4.8 (1M context) <noreply@anthropic.com>
</commit_message>
<xml_diff>
--- a/docs/KOR-BC-Housing-RFPQ-Teaming-Dossier-2026-06-25.docx
+++ b/docs/KOR-BC-Housing-RFPQ-Teaming-Dossier-2026-06-25.docx
@@ -26,7 +26,6 @@
     <w:p>
       <w:pPr>
         <w:pStyle w:val="Heading2"/>
-        <w:pageBreakBefore/>
       </w:pPr>
       <w:bookmarkStart w:id="1" w:name="bottom-line"/>
       <w:r>
@@ -143,7 +142,6 @@
     <w:p>
       <w:pPr>
         <w:pStyle w:val="Heading2"/>
-        <w:pageBreakBefore/>
       </w:pPr>
       <w:bookmarkStart w:id="2" w:name="the-rfpq-confirmed-facts"/>
       <w:bookmarkEnd w:id="1"/>
@@ -164,8 +162,8 @@
         <w:tblLook w:val="0420" w:firstRow="1" w:lastRow="0" w:firstColumn="0" w:lastColumn="0" w:noHBand="0" w:noVBand="1"/>
       </w:tblPr>
       <w:tblGrid>
-        <w:gridCol w:w="4780"/>
-        <w:gridCol w:w="4780"/>
+        <w:gridCol w:w="5220"/>
+        <w:gridCol w:w="5220"/>
       </w:tblGrid>
       <w:tr>
         <w:trPr>
@@ -181,12 +179,12 @@
             <w:pPr>
               <w:pStyle w:val="Compact"/>
               <w:rPr>
-                <w:sz w:val="19"/>
-              </w:rPr>
-            </w:pPr>
-            <w:r>
-              <w:rPr>
-                <w:sz w:val="19"/>
+                <w:sz w:val="17"/>
+              </w:rPr>
+            </w:pPr>
+            <w:r>
+              <w:rPr>
+                <w:sz w:val="17"/>
               </w:rPr>
               <w:t>Field</w:t>
             </w:r>
@@ -200,12 +198,12 @@
             <w:pPr>
               <w:pStyle w:val="Compact"/>
               <w:rPr>
-                <w:sz w:val="19"/>
-              </w:rPr>
-            </w:pPr>
-            <w:r>
-              <w:rPr>
-                <w:sz w:val="19"/>
+                <w:sz w:val="17"/>
+              </w:rPr>
+            </w:pPr>
+            <w:r>
+              <w:rPr>
+                <w:sz w:val="17"/>
               </w:rPr>
               <w:t>Detail</w:t>
             </w:r>
@@ -225,12 +223,12 @@
             <w:pPr>
               <w:pStyle w:val="Compact"/>
               <w:rPr>
-                <w:sz w:val="19"/>
-              </w:rPr>
-            </w:pPr>
-            <w:r>
-              <w:rPr>
-                <w:sz w:val="19"/>
+                <w:sz w:val="17"/>
+              </w:rPr>
+            </w:pPr>
+            <w:r>
+              <w:rPr>
+                <w:sz w:val="17"/>
               </w:rPr>
               <w:t>Owner / #</w:t>
             </w:r>
@@ -244,12 +242,12 @@
             <w:pPr>
               <w:pStyle w:val="Compact"/>
               <w:rPr>
-                <w:sz w:val="19"/>
-              </w:rPr>
-            </w:pPr>
-            <w:r>
-              <w:rPr>
-                <w:sz w:val="19"/>
+                <w:sz w:val="17"/>
+              </w:rPr>
+            </w:pPr>
+            <w:r>
+              <w:rPr>
+                <w:sz w:val="17"/>
               </w:rPr>
               <w:t xml:space="preserve">BC Housing · RFPQ </w:t>
             </w:r>
@@ -257,13 +255,13 @@
               <w:rPr>
                 <w:b/>
                 <w:bCs/>
-                <w:sz w:val="19"/>
+                <w:sz w:val="17"/>
               </w:rPr>
               <w:t>1070-2526-229A</w:t>
             </w:r>
             <w:r>
               <w:rPr>
-                <w:sz w:val="19"/>
+                <w:sz w:val="17"/>
               </w:rPr>
               <w:t xml:space="preserve"> · BC Bid process 230763</w:t>
             </w:r>
@@ -282,12 +280,12 @@
             <w:pPr>
               <w:pStyle w:val="Compact"/>
               <w:rPr>
-                <w:sz w:val="19"/>
-              </w:rPr>
-            </w:pPr>
-            <w:r>
-              <w:rPr>
-                <w:sz w:val="19"/>
+                <w:sz w:val="17"/>
+              </w:rPr>
+            </w:pPr>
+            <w:r>
+              <w:rPr>
+                <w:sz w:val="17"/>
               </w:rPr>
               <w:t>Type</w:t>
             </w:r>
@@ -301,12 +299,12 @@
             <w:pPr>
               <w:pStyle w:val="Compact"/>
               <w:rPr>
-                <w:sz w:val="19"/>
-              </w:rPr>
-            </w:pPr>
-            <w:r>
-              <w:rPr>
-                <w:sz w:val="19"/>
+                <w:sz w:val="17"/>
+              </w:rPr>
+            </w:pPr>
+            <w:r>
+              <w:rPr>
+                <w:sz w:val="17"/>
               </w:rPr>
               <w:t xml:space="preserve">3-year regional prequalified roster of </w:t>
             </w:r>
@@ -314,7 +312,7 @@
               <w:rPr>
                 <w:b/>
                 <w:bCs/>
-                <w:sz w:val="19"/>
+                <w:sz w:val="17"/>
               </w:rPr>
               <w:t>Prime Consultants/Architects</w:t>
             </w:r>
@@ -334,12 +332,12 @@
             <w:pPr>
               <w:pStyle w:val="Compact"/>
               <w:rPr>
-                <w:sz w:val="19"/>
-              </w:rPr>
-            </w:pPr>
-            <w:r>
-              <w:rPr>
-                <w:sz w:val="19"/>
+                <w:sz w:val="17"/>
+              </w:rPr>
+            </w:pPr>
+            <w:r>
+              <w:rPr>
+                <w:sz w:val="17"/>
               </w:rPr>
               <w:t>Streams</w:t>
             </w:r>
@@ -353,20 +351,20 @@
             <w:pPr>
               <w:pStyle w:val="Compact"/>
               <w:rPr>
-                <w:sz w:val="19"/>
+                <w:sz w:val="17"/>
               </w:rPr>
             </w:pPr>
             <w:r>
               <w:rPr>
                 <w:b/>
                 <w:bCs/>
-                <w:sz w:val="19"/>
+                <w:sz w:val="17"/>
               </w:rPr>
               <w:t>Main</w:t>
             </w:r>
             <w:r>
               <w:rPr>
-                <w:sz w:val="19"/>
+                <w:sz w:val="17"/>
               </w:rPr>
               <w:t xml:space="preserve"> (traditional) + </w:t>
             </w:r>
@@ -374,13 +372,13 @@
               <w:rPr>
                 <w:b/>
                 <w:bCs/>
-                <w:sz w:val="19"/>
+                <w:sz w:val="17"/>
               </w:rPr>
               <w:t>DASH</w:t>
             </w:r>
             <w:r>
               <w:rPr>
-                <w:sz w:val="19"/>
+                <w:sz w:val="17"/>
               </w:rPr>
               <w:t xml:space="preserve"> (panelized/kit-of-parts, BIM-mandatory)</w:t>
             </w:r>
@@ -399,12 +397,12 @@
             <w:pPr>
               <w:pStyle w:val="Compact"/>
               <w:rPr>
-                <w:sz w:val="19"/>
-              </w:rPr>
-            </w:pPr>
-            <w:r>
-              <w:rPr>
-                <w:sz w:val="19"/>
+                <w:sz w:val="17"/>
+              </w:rPr>
+            </w:pPr>
+            <w:r>
+              <w:rPr>
+                <w:sz w:val="17"/>
               </w:rPr>
               <w:t>Eligibility</w:t>
             </w:r>
@@ -418,20 +416,20 @@
             <w:pPr>
               <w:pStyle w:val="Compact"/>
               <w:rPr>
-                <w:sz w:val="19"/>
+                <w:sz w:val="17"/>
               </w:rPr>
             </w:pPr>
             <w:r>
               <w:rPr>
                 <w:b/>
                 <w:bCs/>
-                <w:sz w:val="19"/>
+                <w:sz w:val="17"/>
               </w:rPr>
               <w:t>AIBC membership + Certificate of Practice (architects only)</w:t>
             </w:r>
             <w:r>
               <w:rPr>
-                <w:sz w:val="19"/>
+                <w:sz w:val="17"/>
               </w:rPr>
               <w:t>; 7 yrs architectural housing experience + 3 housing projects/10 yrs (§3.2)</w:t>
             </w:r>
@@ -451,12 +449,12 @@
             <w:pPr>
               <w:pStyle w:val="Compact"/>
               <w:rPr>
-                <w:sz w:val="19"/>
-              </w:rPr>
-            </w:pPr>
-            <w:r>
-              <w:rPr>
-                <w:sz w:val="19"/>
+                <w:sz w:val="17"/>
+              </w:rPr>
+            </w:pPr>
+            <w:r>
+              <w:rPr>
+                <w:sz w:val="17"/>
               </w:rPr>
               <w:t>Structural named/scored at prequal?</w:t>
             </w:r>
@@ -470,20 +468,20 @@
             <w:pPr>
               <w:pStyle w:val="Compact"/>
               <w:rPr>
-                <w:sz w:val="19"/>
+                <w:sz w:val="17"/>
               </w:rPr>
             </w:pPr>
             <w:r>
               <w:rPr>
                 <w:b/>
                 <w:bCs/>
-                <w:sz w:val="19"/>
+                <w:sz w:val="17"/>
               </w:rPr>
               <w:t>NO</w:t>
             </w:r>
             <w:r>
               <w:rPr>
-                <w:sz w:val="19"/>
+                <w:sz w:val="17"/>
               </w:rPr>
               <w:t xml:space="preserve"> — rated criteria are Company Experience + Project Mgmt Plan only; no sub-consultant field (Part 2, §3.3, App. D)</w:t>
             </w:r>
@@ -502,12 +500,12 @@
             <w:pPr>
               <w:pStyle w:val="Compact"/>
               <w:rPr>
-                <w:sz w:val="19"/>
-              </w:rPr>
-            </w:pPr>
-            <w:r>
-              <w:rPr>
-                <w:sz w:val="19"/>
+                <w:sz w:val="17"/>
+              </w:rPr>
+            </w:pPr>
+            <w:r>
+              <w:rPr>
+                <w:sz w:val="17"/>
               </w:rPr>
               <w:t>Regions + caps</w:t>
             </w:r>
@@ -521,12 +519,12 @@
             <w:pPr>
               <w:pStyle w:val="Compact"/>
               <w:rPr>
-                <w:sz w:val="19"/>
-              </w:rPr>
-            </w:pPr>
-            <w:r>
-              <w:rPr>
-                <w:sz w:val="19"/>
+                <w:sz w:val="17"/>
+              </w:rPr>
+            </w:pPr>
+            <w:r>
+              <w:rPr>
+                <w:sz w:val="17"/>
               </w:rPr>
               <w:t>Lower Mainland 12 · Vancouver Island 8 · Interior 8 · Northern 6</w:t>
             </w:r>
@@ -546,12 +544,12 @@
             <w:pPr>
               <w:pStyle w:val="Compact"/>
               <w:rPr>
-                <w:sz w:val="19"/>
-              </w:rPr>
-            </w:pPr>
-            <w:r>
-              <w:rPr>
-                <w:sz w:val="19"/>
+                <w:sz w:val="17"/>
+              </w:rPr>
+            </w:pPr>
+            <w:r>
+              <w:rPr>
+                <w:sz w:val="17"/>
               </w:rPr>
               <w:t>Forecast (3 yrs)</w:t>
             </w:r>
@@ -565,12 +563,12 @@
             <w:pPr>
               <w:pStyle w:val="Compact"/>
               <w:rPr>
-                <w:sz w:val="19"/>
-              </w:rPr>
-            </w:pPr>
-            <w:r>
-              <w:rPr>
-                <w:sz w:val="19"/>
+                <w:sz w:val="17"/>
+              </w:rPr>
+            </w:pPr>
+            <w:r>
+              <w:rPr>
+                <w:sz w:val="17"/>
               </w:rPr>
               <w:t>~10–15 multi-unit (primarily DASH) + ~15–20 group-home Stage Two solicitations</w:t>
             </w:r>
@@ -589,12 +587,12 @@
             <w:pPr>
               <w:pStyle w:val="Compact"/>
               <w:rPr>
-                <w:sz w:val="19"/>
-              </w:rPr>
-            </w:pPr>
-            <w:r>
-              <w:rPr>
-                <w:sz w:val="19"/>
+                <w:sz w:val="17"/>
+              </w:rPr>
+            </w:pPr>
+            <w:r>
+              <w:rPr>
+                <w:sz w:val="17"/>
               </w:rPr>
               <w:t>Deadlines</w:t>
             </w:r>
@@ -608,12 +606,12 @@
             <w:pPr>
               <w:pStyle w:val="Compact"/>
               <w:rPr>
-                <w:sz w:val="19"/>
-              </w:rPr>
-            </w:pPr>
-            <w:r>
-              <w:rPr>
-                <w:sz w:val="19"/>
+                <w:sz w:val="17"/>
+              </w:rPr>
+            </w:pPr>
+            <w:r>
+              <w:rPr>
+                <w:sz w:val="17"/>
               </w:rPr>
               <w:t xml:space="preserve">Questions 29 Jun · Addenda 7 Jul · </w:t>
             </w:r>
@@ -621,7 +619,7 @@
               <w:rPr>
                 <w:b/>
                 <w:bCs/>
-                <w:sz w:val="19"/>
+                <w:sz w:val="17"/>
               </w:rPr>
               <w:t>Submission 22 Jul 2026 @ 2 PM PST</w:t>
             </w:r>
@@ -641,12 +639,12 @@
             <w:pPr>
               <w:pStyle w:val="Compact"/>
               <w:rPr>
-                <w:sz w:val="19"/>
-              </w:rPr>
-            </w:pPr>
-            <w:r>
-              <w:rPr>
-                <w:sz w:val="19"/>
+                <w:sz w:val="17"/>
+              </w:rPr>
+            </w:pPr>
+            <w:r>
+              <w:rPr>
+                <w:sz w:val="17"/>
               </w:rPr>
               <w:t>BC Housing contacts</w:t>
             </w:r>
@@ -660,12 +658,12 @@
             <w:pPr>
               <w:pStyle w:val="Compact"/>
               <w:rPr>
-                <w:sz w:val="19"/>
-              </w:rPr>
-            </w:pPr>
-            <w:r>
-              <w:rPr>
-                <w:sz w:val="19"/>
+                <w:sz w:val="17"/>
+              </w:rPr>
+            </w:pPr>
+            <w:r>
+              <w:rPr>
+                <w:sz w:val="17"/>
               </w:rPr>
               <w:t>Sherry Azimi sazimi@bchousing.org · Lucia Campos Pacheco lpacheco@bchousing.org</w:t>
             </w:r>
@@ -676,7 +674,6 @@
     <w:p>
       <w:pPr>
         <w:pStyle w:val="Heading2"/>
-        <w:pageBreakBefore/>
       </w:pPr>
       <w:bookmarkStart w:id="3" w:name="how-kor-participates-verified"/>
       <w:bookmarkEnd w:id="2"/>
@@ -793,7 +790,6 @@
     <w:p>
       <w:pPr>
         <w:pStyle w:val="Heading2"/>
-        <w:pageBreakBefore/>
       </w:pPr>
       <w:bookmarkStart w:id="4" w:name="who-to-call-ranked-deltek-verified"/>
       <w:bookmarkEnd w:id="3"/>
@@ -814,10 +810,10 @@
         <w:tblLook w:val="0420" w:firstRow="1" w:lastRow="0" w:firstColumn="0" w:lastColumn="0" w:noHBand="0" w:noVBand="1"/>
       </w:tblPr>
       <w:tblGrid>
-        <w:gridCol w:w="2131"/>
-        <w:gridCol w:w="2132"/>
-        <w:gridCol w:w="2132"/>
-        <w:gridCol w:w="3165"/>
+        <w:gridCol w:w="2529"/>
+        <w:gridCol w:w="2529"/>
+        <w:gridCol w:w="2529"/>
+        <w:gridCol w:w="2853"/>
       </w:tblGrid>
       <w:tr>
         <w:trPr>
@@ -833,12 +829,12 @@
             <w:pPr>
               <w:pStyle w:val="Compact"/>
               <w:rPr>
-                <w:sz w:val="19"/>
-              </w:rPr>
-            </w:pPr>
-            <w:r>
-              <w:rPr>
-                <w:sz w:val="19"/>
+                <w:sz w:val="17"/>
+              </w:rPr>
+            </w:pPr>
+            <w:r>
+              <w:rPr>
+                <w:sz w:val="17"/>
               </w:rPr>
               <w:t>Tier</w:t>
             </w:r>
@@ -852,12 +848,12 @@
             <w:pPr>
               <w:pStyle w:val="Compact"/>
               <w:rPr>
-                <w:sz w:val="19"/>
-              </w:rPr>
-            </w:pPr>
-            <w:r>
-              <w:rPr>
-                <w:sz w:val="19"/>
+                <w:sz w:val="17"/>
+              </w:rPr>
+            </w:pPr>
+            <w:r>
+              <w:rPr>
+                <w:sz w:val="17"/>
               </w:rPr>
               <w:t>Architect</w:t>
             </w:r>
@@ -871,12 +867,12 @@
             <w:pPr>
               <w:pStyle w:val="Compact"/>
               <w:rPr>
-                <w:sz w:val="19"/>
-              </w:rPr>
-            </w:pPr>
-            <w:r>
-              <w:rPr>
-                <w:sz w:val="19"/>
+                <w:sz w:val="17"/>
+              </w:rPr>
+            </w:pPr>
+            <w:r>
+              <w:rPr>
+                <w:sz w:val="17"/>
               </w:rPr>
               <w:t>KOR depth / BC Housing fit</w:t>
             </w:r>
@@ -890,12 +886,12 @@
             <w:pPr>
               <w:pStyle w:val="Compact"/>
               <w:rPr>
-                <w:sz w:val="19"/>
-              </w:rPr>
-            </w:pPr>
-            <w:r>
-              <w:rPr>
-                <w:sz w:val="19"/>
+                <w:sz w:val="17"/>
+              </w:rPr>
+            </w:pPr>
+            <w:r>
+              <w:rPr>
+                <w:sz w:val="17"/>
               </w:rPr>
               <w:t>Contact</w:t>
             </w:r>
@@ -915,12 +911,12 @@
             <w:pPr>
               <w:pStyle w:val="Compact"/>
               <w:rPr>
-                <w:sz w:val="19"/>
-              </w:rPr>
-            </w:pPr>
-            <w:r>
-              <w:rPr>
-                <w:sz w:val="19"/>
+                <w:sz w:val="17"/>
+              </w:rPr>
+            </w:pPr>
+            <w:r>
+              <w:rPr>
+                <w:sz w:val="17"/>
               </w:rPr>
               <w:t>1</w:t>
             </w:r>
@@ -934,14 +930,14 @@
             <w:pPr>
               <w:pStyle w:val="Compact"/>
               <w:rPr>
-                <w:sz w:val="19"/>
+                <w:sz w:val="17"/>
               </w:rPr>
             </w:pPr>
             <w:r>
               <w:rPr>
                 <w:b/>
                 <w:bCs/>
-                <w:sz w:val="19"/>
+                <w:sz w:val="17"/>
               </w:rPr>
               <w:t>GBL Architects</w:t>
             </w:r>
@@ -955,12 +951,12 @@
             <w:pPr>
               <w:pStyle w:val="Compact"/>
               <w:rPr>
-                <w:sz w:val="19"/>
-              </w:rPr>
-            </w:pPr>
-            <w:r>
-              <w:rPr>
-                <w:sz w:val="19"/>
+                <w:sz w:val="17"/>
+              </w:rPr>
+            </w:pPr>
+            <w:r>
+              <w:rPr>
+                <w:sz w:val="17"/>
               </w:rPr>
               <w:t xml:space="preserve">client, 9 active · </w:t>
             </w:r>
@@ -968,13 +964,13 @@
               <w:rPr>
                 <w:b/>
                 <w:bCs/>
-                <w:sz w:val="19"/>
+                <w:sz w:val="17"/>
               </w:rPr>
               <w:t>confirmed BC Housing affordable architect</w:t>
             </w:r>
             <w:r>
               <w:rPr>
-                <w:sz w:val="19"/>
+                <w:sz w:val="17"/>
               </w:rPr>
               <w:t xml:space="preserve"> (New West 1923 Marine)</w:t>
             </w:r>
@@ -988,12 +984,12 @@
             <w:pPr>
               <w:pStyle w:val="Compact"/>
               <w:rPr>
-                <w:sz w:val="19"/>
-              </w:rPr>
-            </w:pPr>
-            <w:r>
-              <w:rPr>
-                <w:sz w:val="19"/>
+                <w:sz w:val="17"/>
+              </w:rPr>
+            </w:pPr>
+            <w:r>
+              <w:rPr>
+                <w:sz w:val="17"/>
               </w:rPr>
               <w:t>Stu Lyon slyon@gblarchitects.com · Amela Brudar abrudar@gblarchitects.com</w:t>
             </w:r>
@@ -1012,12 +1008,12 @@
             <w:pPr>
               <w:pStyle w:val="Compact"/>
               <w:rPr>
-                <w:sz w:val="19"/>
-              </w:rPr>
-            </w:pPr>
-            <w:r>
-              <w:rPr>
-                <w:sz w:val="19"/>
+                <w:sz w:val="17"/>
+              </w:rPr>
+            </w:pPr>
+            <w:r>
+              <w:rPr>
+                <w:sz w:val="17"/>
               </w:rPr>
               <w:t>1</w:t>
             </w:r>
@@ -1031,14 +1027,14 @@
             <w:pPr>
               <w:pStyle w:val="Compact"/>
               <w:rPr>
-                <w:sz w:val="19"/>
+                <w:sz w:val="17"/>
               </w:rPr>
             </w:pPr>
             <w:r>
               <w:rPr>
                 <w:b/>
                 <w:bCs/>
-                <w:sz w:val="19"/>
+                <w:sz w:val="17"/>
               </w:rPr>
               <w:t>NSDA Architects</w:t>
             </w:r>
@@ -1052,12 +1048,12 @@
             <w:pPr>
               <w:pStyle w:val="Compact"/>
               <w:rPr>
-                <w:sz w:val="19"/>
-              </w:rPr>
-            </w:pPr>
-            <w:r>
-              <w:rPr>
-                <w:sz w:val="19"/>
+                <w:sz w:val="17"/>
+              </w:rPr>
+            </w:pPr>
+            <w:r>
+              <w:rPr>
+                <w:sz w:val="17"/>
               </w:rPr>
               <w:t xml:space="preserve">client · </w:t>
             </w:r>
@@ -1065,13 +1061,13 @@
               <w:rPr>
                 <w:b/>
                 <w:bCs/>
-                <w:sz w:val="19"/>
+                <w:sz w:val="17"/>
               </w:rPr>
               <w:t>28 KOR projects</w:t>
             </w:r>
             <w:r>
               <w:rPr>
-                <w:sz w:val="19"/>
+                <w:sz w:val="17"/>
               </w:rPr>
               <w:t xml:space="preserve"> (deepest)</w:t>
             </w:r>
@@ -1085,12 +1081,12 @@
             <w:pPr>
               <w:pStyle w:val="Compact"/>
               <w:rPr>
-                <w:sz w:val="19"/>
-              </w:rPr>
-            </w:pPr>
-            <w:r>
-              <w:rPr>
-                <w:sz w:val="19"/>
+                <w:sz w:val="17"/>
+              </w:rPr>
+            </w:pPr>
+            <w:r>
+              <w:rPr>
+                <w:sz w:val="17"/>
               </w:rPr>
               <w:t>Ken Wong kwong@nsda.bc.ca</w:t>
             </w:r>
@@ -1110,12 +1106,12 @@
             <w:pPr>
               <w:pStyle w:val="Compact"/>
               <w:rPr>
-                <w:sz w:val="19"/>
-              </w:rPr>
-            </w:pPr>
-            <w:r>
-              <w:rPr>
-                <w:sz w:val="19"/>
+                <w:sz w:val="17"/>
+              </w:rPr>
+            </w:pPr>
+            <w:r>
+              <w:rPr>
+                <w:sz w:val="17"/>
               </w:rPr>
               <w:t>1</w:t>
             </w:r>
@@ -1129,12 +1125,12 @@
             <w:pPr>
               <w:pStyle w:val="Compact"/>
               <w:rPr>
-                <w:sz w:val="19"/>
-              </w:rPr>
-            </w:pPr>
-            <w:r>
-              <w:rPr>
-                <w:sz w:val="19"/>
+                <w:sz w:val="17"/>
+              </w:rPr>
+            </w:pPr>
+            <w:r>
+              <w:rPr>
+                <w:sz w:val="17"/>
               </w:rPr>
               <w:t>Chris Dikeakos / Studio One / Ciccozzi</w:t>
             </w:r>
@@ -1148,12 +1144,12 @@
             <w:pPr>
               <w:pStyle w:val="Compact"/>
               <w:rPr>
-                <w:sz w:val="19"/>
-              </w:rPr>
-            </w:pPr>
-            <w:r>
-              <w:rPr>
-                <w:sz w:val="19"/>
+                <w:sz w:val="17"/>
+              </w:rPr>
+            </w:pPr>
+            <w:r>
+              <w:rPr>
+                <w:sz w:val="17"/>
               </w:rPr>
               <w:t>8 / 13 / 7 KOR projects (warm; confirm affordable intent)</w:t>
             </w:r>
@@ -1167,12 +1163,12 @@
             <w:pPr>
               <w:pStyle w:val="Compact"/>
               <w:rPr>
-                <w:sz w:val="19"/>
-              </w:rPr>
-            </w:pPr>
-            <w:r>
-              <w:rPr>
-                <w:sz w:val="19"/>
+                <w:sz w:val="17"/>
+              </w:rPr>
+            </w:pPr>
+            <w:r>
+              <w:rPr>
+                <w:sz w:val="17"/>
               </w:rPr>
               <w:t>chris@dikeakos.com · (Studio One via office) · rob@ciccozziarchitecture.com</w:t>
             </w:r>
@@ -1191,12 +1187,12 @@
             <w:pPr>
               <w:pStyle w:val="Compact"/>
               <w:rPr>
-                <w:sz w:val="19"/>
-              </w:rPr>
-            </w:pPr>
-            <w:r>
-              <w:rPr>
-                <w:sz w:val="19"/>
+                <w:sz w:val="17"/>
+              </w:rPr>
+            </w:pPr>
+            <w:r>
+              <w:rPr>
+                <w:sz w:val="17"/>
               </w:rPr>
               <w:t>DASH</w:t>
             </w:r>
@@ -1210,14 +1206,14 @@
             <w:pPr>
               <w:pStyle w:val="Compact"/>
               <w:rPr>
-                <w:sz w:val="19"/>
+                <w:sz w:val="17"/>
               </w:rPr>
             </w:pPr>
             <w:r>
               <w:rPr>
                 <w:b/>
                 <w:bCs/>
-                <w:sz w:val="19"/>
+                <w:sz w:val="17"/>
               </w:rPr>
               <w:t>Acton Ostry</w:t>
             </w:r>
@@ -1231,12 +1227,12 @@
             <w:pPr>
               <w:pStyle w:val="Compact"/>
               <w:rPr>
-                <w:sz w:val="19"/>
-              </w:rPr>
-            </w:pPr>
-            <w:r>
-              <w:rPr>
-                <w:sz w:val="19"/>
+                <w:sz w:val="17"/>
+              </w:rPr>
+            </w:pPr>
+            <w:r>
+              <w:rPr>
+                <w:sz w:val="17"/>
               </w:rPr>
               <w:t>mass-timber housing (Brock Commons) — strong DASH fit</w:t>
             </w:r>
@@ -1250,12 +1246,12 @@
             <w:pPr>
               <w:pStyle w:val="Compact"/>
               <w:rPr>
-                <w:sz w:val="19"/>
-              </w:rPr>
-            </w:pPr>
-            <w:r>
-              <w:rPr>
-                <w:sz w:val="19"/>
+                <w:sz w:val="17"/>
+              </w:rPr>
+            </w:pPr>
+            <w:r>
+              <w:rPr>
+                <w:sz w:val="17"/>
               </w:rPr>
               <w:t>Russell Acton racton@actonostry.ca · Mark Ostry mostry@actonostry.ca</w:t>
             </w:r>
@@ -1275,12 +1271,12 @@
             <w:pPr>
               <w:pStyle w:val="Compact"/>
               <w:rPr>
-                <w:sz w:val="19"/>
-              </w:rPr>
-            </w:pPr>
-            <w:r>
-              <w:rPr>
-                <w:sz w:val="19"/>
+                <w:sz w:val="17"/>
+              </w:rPr>
+            </w:pPr>
+            <w:r>
+              <w:rPr>
+                <w:sz w:val="17"/>
               </w:rPr>
               <w:t>Specialists</w:t>
             </w:r>
@@ -1294,12 +1290,12 @@
             <w:pPr>
               <w:pStyle w:val="Compact"/>
               <w:rPr>
-                <w:sz w:val="19"/>
-              </w:rPr>
-            </w:pPr>
-            <w:r>
-              <w:rPr>
-                <w:sz w:val="19"/>
+                <w:sz w:val="17"/>
+              </w:rPr>
+            </w:pPr>
+            <w:r>
+              <w:rPr>
+                <w:sz w:val="17"/>
               </w:rPr>
               <w:t>Zeidler · Richard Hunter · Formline</w:t>
             </w:r>
@@ -1313,12 +1309,12 @@
             <w:pPr>
               <w:pStyle w:val="Compact"/>
               <w:rPr>
-                <w:sz w:val="19"/>
-              </w:rPr>
-            </w:pPr>
-            <w:r>
-              <w:rPr>
-                <w:sz w:val="19"/>
+                <w:sz w:val="17"/>
+              </w:rPr>
+            </w:pPr>
+            <w:r>
+              <w:rPr>
+                <w:sz w:val="17"/>
               </w:rPr>
               <w:t>active BC Housing/affordable, lower KOR depth</w:t>
             </w:r>
@@ -1332,12 +1328,12 @@
             <w:pPr>
               <w:pStyle w:val="Compact"/>
               <w:rPr>
-                <w:sz w:val="19"/>
-              </w:rPr>
-            </w:pPr>
-            <w:r>
-              <w:rPr>
-                <w:sz w:val="19"/>
+                <w:sz w:val="17"/>
+              </w:rPr>
+            </w:pPr>
+            <w:r>
+              <w:rPr>
+                <w:sz w:val="17"/>
               </w:rPr>
               <w:t>via firm offices</w:t>
             </w:r>
@@ -1360,7 +1356,6 @@
     <w:p>
       <w:pPr>
         <w:pStyle w:val="Heading2"/>
-        <w:pageBreakBefore/>
       </w:pPr>
       <w:bookmarkStart w:id="5" w:name="the-play"/>
       <w:bookmarkEnd w:id="4"/>
@@ -1448,7 +1443,6 @@
     <w:p>
       <w:pPr>
         <w:pStyle w:val="Heading2"/>
-        <w:pageBreakBefore/>
       </w:pPr>
       <w:bookmarkStart w:id="6" w:name="why-we-missed-it-and-the-fix"/>
       <w:bookmarkEnd w:id="5"/>
@@ -1523,8 +1517,9 @@
         <w:numRestart w:val="eachSect"/>
       </w:footnotePr>
       <w:pgSz w:w="12240" w:h="15840"/>
-      <w:pgMar w:top="1440" w:right="1440" w:bottom="1440" w:left="1440" w:header="720" w:footer="720" w:gutter="0"/>
+      <w:pgMar w:top="860" w:right="1000" w:bottom="860" w:left="1000" w:header="720" w:footer="720" w:gutter="0"/>
       <w:cols w:space="720"/>
+      <w:docGrid w:linePitch="245"/>
     </w:sectPr>
   </w:body>
 </w:document>
@@ -1535,7 +1530,7 @@
   <w:abstractNum w:abstractNumId="0" w15:restartNumberingAfterBreak="0">
     <w:nsid w:val="0000A990"/>
     <w:multiLevelType w:val="multilevel"/>
-    <w:tmpl w:val="E50CBB94"/>
+    <w:tmpl w:val="98021A80"/>
     <w:lvl w:ilvl="0">
       <w:numFmt w:val="bullet"/>
       <w:lvlText w:val=" "/>
@@ -1612,7 +1607,7 @@
   <w:abstractNum w:abstractNumId="1" w15:restartNumberingAfterBreak="0">
     <w:nsid w:val="0000A991"/>
     <w:multiLevelType w:val="multilevel"/>
-    <w:tmpl w:val="4E0A601C"/>
+    <w:tmpl w:val="FD80C4B0"/>
     <w:lvl w:ilvl="0">
       <w:numFmt w:val="bullet"/>
       <w:lvlText w:val=""/>
@@ -1716,7 +1711,7 @@
   <w:abstractNum w:abstractNumId="2" w15:restartNumberingAfterBreak="0">
     <w:nsid w:val="00A99411"/>
     <w:multiLevelType w:val="multilevel"/>
-    <w:tmpl w:val="AA4832DC"/>
+    <w:tmpl w:val="B958E50E"/>
     <w:lvl w:ilvl="0">
       <w:start w:val="1"/>
       <w:numFmt w:val="decimal"/>
@@ -1799,16 +1794,16 @@
       </w:pPr>
     </w:lvl>
   </w:abstractNum>
-  <w:num w:numId="1" w16cid:durableId="137459117">
+  <w:num w:numId="1" w16cid:durableId="560530554">
     <w:abstractNumId w:val="0"/>
   </w:num>
-  <w:num w:numId="2" w16cid:durableId="760027012">
+  <w:num w:numId="2" w16cid:durableId="1890023554">
     <w:abstractNumId w:val="1"/>
   </w:num>
-  <w:num w:numId="3" w16cid:durableId="834153530">
+  <w:num w:numId="3" w16cid:durableId="1930919716">
     <w:abstractNumId w:val="1"/>
   </w:num>
-  <w:num w:numId="4" w16cid:durableId="175702190">
+  <w:num w:numId="4" w16cid:durableId="1908999822">
     <w:abstractNumId w:val="2"/>
     <w:lvlOverride w:ilvl="0">
       <w:startOverride w:val="1"/>
@@ -2106,11 +2101,11 @@
     <w:name w:val="Normal"/>
     <w:qFormat/>
     <w:pPr>
-      <w:spacing w:after="120"/>
+      <w:spacing w:after="40"/>
     </w:pPr>
     <w:rPr>
       <w:rFonts w:ascii="Calibri" w:hAnsi="Calibri" w:cs="Calibri"/>
-      <w:sz w:val="21"/>
+      <w:sz w:val="18"/>
     </w:rPr>
   </w:style>
   <w:style w:type="paragraph" w:styleId="Heading1">
@@ -2124,14 +2119,14 @@
     <w:pPr>
       <w:keepNext/>
       <w:keepLines/>
-      <w:spacing w:before="240" w:after="80"/>
+      <w:spacing w:before="100" w:after="20"/>
       <w:outlineLvl w:val="0"/>
     </w:pPr>
     <w:rPr>
       <w:rFonts w:eastAsiaTheme="majorEastAsia"/>
       <w:b/>
       <w:color w:val="1F3B5F"/>
-      <w:sz w:val="30"/>
+      <w:sz w:val="24"/>
       <w:szCs w:val="40"/>
     </w:rPr>
   </w:style>
@@ -2195,7 +2190,7 @@
     <w:pPr>
       <w:keepNext/>
       <w:keepLines/>
-      <w:spacing w:before="80" w:after="40"/>
+      <w:spacing w:before="80"/>
       <w:outlineLvl w:val="3"/>
     </w:pPr>
     <w:rPr>
@@ -2218,7 +2213,7 @@
     <w:pPr>
       <w:keepNext/>
       <w:keepLines/>
-      <w:spacing w:before="80" w:after="40"/>
+      <w:spacing w:before="80"/>
       <w:outlineLvl w:val="4"/>
     </w:pPr>
     <w:rPr>
@@ -2373,7 +2368,7 @@
     <w:rsid w:val="00A10FD9"/>
     <w:pPr>
       <w:keepNext/>
-      <w:spacing w:before="240" w:after="80"/>
+      <w:spacing w:before="100" w:after="20"/>
       <w:contextualSpacing/>
       <w:jc w:val="center"/>
     </w:pPr>
@@ -2381,7 +2376,7 @@
       <w:rFonts w:eastAsiaTheme="majorEastAsia"/>
       <w:b/>
       <w:color w:val="1F3B5F"/>
-      <w:sz w:val="40"/>
+      <w:sz w:val="26"/>
       <w:szCs w:val="56"/>
     </w:rPr>
   </w:style>
@@ -2395,7 +2390,7 @@
       <w:rFonts w:ascii="Calibri" w:eastAsiaTheme="majorEastAsia" w:hAnsi="Calibri" w:cs="Calibri"/>
       <w:b/>
       <w:color w:val="1F3B5F"/>
-      <w:sz w:val="40"/>
+      <w:sz w:val="26"/>
       <w:szCs w:val="56"/>
     </w:rPr>
   </w:style>
@@ -2506,7 +2501,6 @@
       <w:rFonts w:ascii="Calibri" w:eastAsiaTheme="majorEastAsia" w:hAnsi="Calibri" w:cs="Calibri"/>
       <w:b/>
       <w:color w:val="1F3B5F"/>
-      <w:sz w:val="30"/>
       <w:szCs w:val="40"/>
     </w:rPr>
   </w:style>
@@ -2693,6 +2687,9 @@
     <w:name w:val="caption"/>
     <w:basedOn w:val="Normal"/>
     <w:link w:val="CaptionChar"/>
+    <w:pPr>
+      <w:spacing w:after="120"/>
+    </w:pPr>
     <w:rPr>
       <w:i/>
     </w:rPr>
@@ -2759,7 +2756,7 @@
     <w:unhideWhenUsed/>
     <w:qFormat/>
     <w:pPr>
-      <w:spacing w:line="259" w:lineRule="auto"/>
+      <w:spacing w:before="240" w:line="259" w:lineRule="auto"/>
       <w:outlineLvl w:val="9"/>
     </w:pPr>
     <w:rPr>
@@ -3070,7 +3067,7 @@
     <w:name w:val="Grid Table 4"/>
     <w:basedOn w:val="TableNormal"/>
     <w:uiPriority w:val="49"/>
-    <w:rsid w:val="001978FE"/>
+    <w:rsid w:val="003A7668"/>
     <w:pPr>
       <w:spacing w:after="0"/>
     </w:pPr>

</xml_diff>